<commit_message>
Update SEO report with AI discovery and render fixes
</commit_message>
<xml_diff>
--- a/reports/weekly-milestones/Toolkit_Weekly_Milestone_08_SEO_Milestones_and_Fixes_17_July_2026.docx
+++ b/reports/weekly-milestones/Toolkit_Weekly_Milestone_08_SEO_Milestones_and_Fixes_17_July_2026.docx
@@ -687,6 +687,22 @@
       </w:r>
     </w:p>
     <w:p>
+      <w:pPr>
+        <w:pStyle w:val="ListBullet"/>
+      </w:pPr>
+      <w:r>
+        <w:t>Public llms.txt and llms-full.txt discovery documents with canonical resources, organization context, learning areas, and safeguards against premature pricing disclosure.</w:t>
+      </w:r>
+    </w:p>
+    <w:p>
+      <w:pPr>
+        <w:pStyle w:val="ListBullet"/>
+      </w:pPr>
+      <w:r>
+        <w:t>Removal of Thim's generated Roboto/Roboto Slab subsets and non-blocking fallback delivery of the 641 KB parent stylesheet.</w:t>
+      </w:r>
+    </w:p>
+    <w:p>
       <w:r>
         <w:br w:type="page"/>
       </w:r>
@@ -1149,6 +1165,70 @@
           </w:p>
         </w:tc>
       </w:tr>
+      <w:tr>
+        <w:tc>
+          <w:tcPr>
+            <w:tcW w:type="dxa" w:w="3389"/>
+          </w:tcPr>
+          <w:p>
+            <w:r>
+              <w:t>LLM discovery</w:t>
+            </w:r>
+          </w:p>
+        </w:tc>
+        <w:tc>
+          <w:tcPr>
+            <w:tcW w:type="dxa" w:w="3389"/>
+          </w:tcPr>
+          <w:p>
+            <w:r>
+              <w:t>Published concise and expanded AI-readable site guides with pricing rules.</w:t>
+            </w:r>
+          </w:p>
+        </w:tc>
+        <w:tc>
+          <w:tcPr>
+            <w:tcW w:type="dxa" w:w="3389"/>
+          </w:tcPr>
+          <w:p>
+            <w:r>
+              <w:t>Both endpoints return indexed text/plain.</w:t>
+            </w:r>
+          </w:p>
+        </w:tc>
+      </w:tr>
+      <w:tr>
+        <w:tc>
+          <w:tcPr>
+            <w:tcW w:type="dxa" w:w="3389"/>
+          </w:tcPr>
+          <w:p>
+            <w:r>
+              <w:t>Font/render blocking</w:t>
+            </w:r>
+          </w:p>
+        </w:tc>
+        <w:tc>
+          <w:tcPr>
+            <w:tcW w:type="dxa" w:w="3389"/>
+          </w:tcPr>
+          <w:p>
+            <w:r>
+              <w:t>Removed generated font subsets and moved parent CSS to asynchronous fallback loading.</w:t>
+            </w:r>
+          </w:p>
+        </w:tc>
+        <w:tc>
+          <w:tcPr>
+            <w:tcW w:type="dxa" w:w="3389"/>
+          </w:tcPr>
+          <w:p>
+            <w:r>
+              <w:t>No live font-face output; parent CSS is non-blocking.</w:t>
+            </w:r>
+          </w:p>
+        </w:tc>
+      </w:tr>
     </w:tbl>
     <w:p>
       <w:pPr>
@@ -1264,7 +1344,7 @@
         <w:pStyle w:val="ListBullet"/>
       </w:pPr>
       <w:r>
-        <w:t>Reduce remaining font-display delay by consolidating parent-theme icon/font families.</w:t>
+        <w:t>Measure the new Speed Index through repeated PageSpeed runs after regional caches have warmed.</w:t>
       </w:r>
     </w:p>
     <w:p>
@@ -1272,7 +1352,7 @@
         <w:pStyle w:val="ListBullet"/>
       </w:pPr>
       <w:r>
-        <w:t>Further isolate critical header/footer CSS from the parent Eduma stylesheet after full regression testing.</w:t>
+        <w:t>Continue reducing the remaining 74 KB of child-owned critical CSS through per-template extraction after regression testing.</w:t>
       </w:r>
     </w:p>
     <w:p>

</xml_diff>